<commit_message>
Update defense deck and Q&A for the messaging removal
Slide 8 replaces messaging with the review rules, slide 9 drops to five events, and slide 10 is reframed around revenue from completed bookings rather than recorded payments. The Q&A gains an honest answer on how attendance is inferred, and one explaining why messaging was removed.
</commit_message>
<xml_diff>
--- a/docs/StyleBook-Defense-QA.docx
+++ b/docs/StyleBook-Defense-QA.docx
@@ -139,7 +139,7 @@
           <w:sz w:val="21"/>
           <w:szCs w:val="21"/>
         </w:rPr>
-        <w:t xml:space="preserve">In Ghana, booking a salon or barbershop appointment is almost entirely informal — you walk in and wait, or you call and hope someone answers. Customers waste time, and shop owners cannot see or plan their day. StyleBook digitises this: customers discover nearby shops, see real prices and opening hours, book exact time slots, and message the shop directly; owners manage bookings, payments, services, photos and reviews from one dashboard.</w:t>
+        <w:t xml:space="preserve">In Ghana, booking a salon or barbershop appointment is almost entirely informal — you walk in and wait, or you call and hope someone answers. Customers waste time, and shop owners cannot see or plan their day. StyleBook digitises this: customers discover nearby shops, see real prices and opening hours, and book exact time slots; owners manage bookings, services, photos and reviews from one dashboard.</w:t>
       </w:r>
     </w:p>
     <w:p>
@@ -181,7 +181,7 @@
           <w:sz w:val="21"/>
           <w:szCs w:val="21"/>
         </w:rPr>
-        <w:t xml:space="preserve">Two distinct user groups, each with a dedicated flow in the app: customers seeking beauty or barbering services, and business owners running salons, barbershops, spas and nail studios. The separation is enforced at registration and carried in the JWT, so a customer account cannot reach owner screens and vice versa.</w:t>
+        <w:t xml:space="preserve">Two distinct groups, each with a dedicated flow: customers seeking beauty or barbering services, and business owners running salons, barbershops, spas and nail studios. The separation is enforced at registration and carried in the JWT, so a customer account cannot reach owner screens and vice versa.</w:t>
       </w:r>
     </w:p>
     <w:p>
@@ -265,7 +265,7 @@
           <w:sz w:val="21"/>
           <w:szCs w:val="21"/>
         </w:rPr>
-        <w:t xml:space="preserve">A freemium subscription for shop owners with three tiers: Free (3 gallery photos, 5 posts, no promo offers), Pro at GHS 120 per month, and Enterprise at GHS 300 per month with multi-branch support and sponsored placement. Customers never pay to use the app, which protects adoption on the demand side. The photo, post and promo limits are enforced server-side, not merely hidden in the interface.</w:t>
+        <w:t xml:space="preserve">A freemium subscription for shop owners: Free (3 gallery photos, 5 posts, no promo offers), Pro at GHS 120 per month, and Enterprise at GHS 300 per month with multi-branch support and sponsored placement. Customers never pay, which protects adoption on the demand side. The photo, post and promo limits are enforced server-side, not merely hidden in the interface.</w:t>
       </w:r>
     </w:p>
     <w:p>
@@ -324,7 +324,7 @@
           <w:sz w:val="21"/>
           <w:szCs w:val="21"/>
         </w:rPr>
-        <w:t xml:space="preserve">Spring Boot supplies production infrastructure out of the box: dependency injection, Spring Data JPA, Spring Security, bean validation, scheduled tasks, an application event bus, and an embedded Tomcat. Its layered structure keeps business logic organised and testable. Java 17's strong typing catches errors at compile time, which matters in a booking system where correctness affects real appointments.</w:t>
+        <w:t xml:space="preserve">It supplies production infrastructure out of the box: dependency injection, Spring Data JPA, Spring Security, bean validation, scheduled tasks, an application event bus, and an embedded Tomcat. The layered structure keeps business logic organised and testable, and Java 17's strong typing catches errors at compile time — which matters in a booking system where correctness affects real appointments.</w:t>
       </w:r>
     </w:p>
     <w:p>
@@ -366,7 +366,7 @@
           <w:sz w:val="21"/>
           <w:szCs w:val="21"/>
         </w:rPr>
-        <w:t xml:space="preserve">One TypeScript codebase produces both Android and iOS apps. Expo provides device APIs — GPS, image picker, notifications — without writing native code, and Expo Go allowed instant testing on two physical phones during development, one signed in as a customer and one as an owner. For the final build, EAS Build produces an installable APK, which is also what makes push notifications testable: Expo Go cannot receive remote push on SDK 54.</w:t>
+        <w:t xml:space="preserve">One TypeScript codebase produces both Android and iOS apps. Expo provides device APIs — GPS, image picker, notifications — without writing native code, and Expo Go allowed instant testing on two physical phones during development. For the final build, EAS Build produces an installable APK, which is also what makes push notifications testable: Expo Go cannot receive remote push on SDK 54.</w:t>
       </w:r>
     </w:p>
     <w:p>
@@ -408,7 +408,7 @@
           <w:sz w:val="21"/>
           <w:szCs w:val="21"/>
         </w:rPr>
-        <w:t xml:space="preserve">The data is inherently relational: a booking references a customer, a shop and a service; a review references a booking; a message references a conversation. PostgreSQL enforces those relationships with foreign keys and provides ACID transactions, which is what prevents corruption when two customers try to take the same slot at the same instant. It also has native UUID support and a JSON column type, which the notification payloads use.</w:t>
+        <w:t xml:space="preserve">The data is inherently relational: a booking references a customer, a shop and a service; a review references a booking. PostgreSQL enforces those relationships with foreign keys and provides ACID transactions, which prevents corruption when two customers try to take the same slot at the same instant. It also has native UUID support and a JSON column type, which the notification payloads use.</w:t>
       </w:r>
     </w:p>
     <w:p>
@@ -450,7 +450,7 @@
           <w:sz w:val="21"/>
           <w:szCs w:val="21"/>
         </w:rPr>
-        <w:t xml:space="preserve">Over a REST API with JSON payloads. The app uses Axios with a request interceptor that attaches the JWT to every request. The backend exposes roughly sixty endpoints grouped by resource: /api/auth, /api/shops, /api/bookings, /api/reviews, /api/posts, /api/promos, /api/messages and /api/notifications. There is also a STOMP WebSocket endpoint at /ws for live delivery of notifications and chat messages.</w:t>
+        <w:t xml:space="preserve">Over a REST API with JSON payloads. The app uses Axios with a request interceptor that attaches the JWT to every request, and a response interceptor that turns a missing response — a timeout or lost signal — into a readable connectivity message rather than a generic failure. The backend exposes roughly fifty endpoints grouped by resource: /api/auth, /api/shops, /api/bookings, /api/reviews, /api/posts, /api/promos and /api/notifications, plus a STOMP WebSocket endpoint at /ws.</w:t>
       </w:r>
     </w:p>
     <w:p>
@@ -509,7 +509,7 @@
           <w:sz w:val="21"/>
           <w:szCs w:val="21"/>
         </w:rPr>
-        <w:t xml:space="preserve">Client-server. The React Native client handles presentation and local state; the Spring Boot server owns all business rules and persistence. The server is layered: controllers handle HTTP and delegate; services contain business logic such as slot calculation, chat membership and auto-confirmation; repositories handle data access through Spring Data JPA; DTOs decouple the API contract from internal entities.</w:t>
+        <w:t xml:space="preserve">Client-server. The React Native client handles presentation and local state; the Spring Boot server owns all business rules and persistence. The server is layered: controllers handle HTTP and delegate; services contain business logic such as slot calculation and auto-confirmation; repositories handle data access through Spring Data JPA; DTOs decouple the API contract from internal entities.</w:t>
       </w:r>
     </w:p>
     <w:p>
@@ -551,7 +551,7 @@
           <w:sz w:val="21"/>
           <w:szCs w:val="21"/>
         </w:rPr>
-        <w:t xml:space="preserve">It is a modular monolith organised service-by-service — AuthService, ShopService, BookingService, ReviewService, PostService, PromoService, MessagingService and NotificationService — each owning its own domain and repositories. At this scale a single deployable is the correct engineering choice: it avoids network latency, distributed transactions and operational overhead. Because the boundaries are already clean, any domain could be extracted into its own service later. That migration path was a deliberate design consideration rather than an accident.</w:t>
+        <w:t xml:space="preserve">It is a modular monolith organised service-by-service — AuthService, ShopService, BookingService, ReviewService, PostService, PromoService and NotificationService — each owning its own domain and repositories. At this scale a single deployable is the correct engineering choice: it avoids network latency, distributed transactions and operational overhead. Because the boundaries are already clean, any domain could be extracted later. That migration path was a deliberate design consideration rather than an accident.</w:t>
       </w:r>
     </w:p>
     <w:p>
@@ -593,7 +593,7 @@
           <w:sz w:val="21"/>
           <w:szCs w:val="21"/>
         </w:rPr>
-        <w:t xml:space="preserve">Through Spring's application event bus. When something happens that another feature might care about, the originating service publishes a domain event and moves on — BookingRequestedEvent, BookingStatusChangedEvent, ReviewCreatedEvent, PostInteractionEvent, MessageCreatedEvent, PaymentReceivedEvent. Listener components subscribe and turn those into notifications. The practical consequence is that BookingService contains no reference to the notification system at all, and adding a seventh event later requires changing nothing that already exists.</w:t>
+        <w:t xml:space="preserve">Through Spring's application event bus. When something happens that another feature might care about, the originating service publishes a domain event and moves on — BookingRequestedEvent, BookingStatusChangedEvent, ReviewCreatedEvent, PostInteractionEvent, PaymentReceivedEvent. Listener components subscribe and turn those into notifications. The practical consequence is that BookingService contains no reference to the notification system at all, and adding a sixth event later requires changing nothing that already exists.</w:t>
       </w:r>
     </w:p>
     <w:p>
@@ -635,7 +635,7 @@
           <w:sz w:val="21"/>
           <w:szCs w:val="21"/>
         </w:rPr>
-        <w:t xml:space="preserve">Repository pattern for data access; DTO pattern to shape API responses; dependency injection throughout; the Builder pattern via Lombok for entity construction; the observer pattern through Spring's event publisher and listeners; and on the frontend, the Provider pattern with React Context for authentication and theming, plus a centralised API client with an interceptor.</w:t>
+        <w:t xml:space="preserve">Repository pattern for data access; DTO pattern to shape API responses; dependency injection throughout; the Builder pattern via Lombok for entity construction; the observer pattern through Spring's event publisher and listeners; and on the frontend, the Provider pattern with React Context for authentication and theming, plus a centralised API client with interceptors.</w:t>
       </w:r>
     </w:p>
     <w:p>
@@ -677,7 +677,7 @@
           <w:sz w:val="21"/>
           <w:szCs w:val="21"/>
         </w:rPr>
-        <w:t xml:space="preserve">Two global contexts: AuthContext holding the current user and JWT, and ThemeContext for light and dark mode. Screen data is local state fetched on demand, with pull-to-refresh and short polling where freshness matters — an open chat thread polls every five seconds, the notification bell every thirty, and the owner's bookings inbox every thirty. Theme choice and device-local settings persist in AsyncStorage; notification preferences deliberately do not, because they belong to the account rather than the handset.</w:t>
+        <w:t xml:space="preserve">Two global contexts: AuthContext holding the current user and JWT, and ThemeContext for light and dark mode. Screen data is local state fetched on demand, with pull-to-refresh and short polling where freshness matters — the notification bell every thirty seconds, the owner's bookings inbox every thirty. Theme choice and device-local settings persist in AsyncStorage; notification preferences deliberately do not, because they belong to the account rather than the handset.</w:t>
       </w:r>
     </w:p>
     <w:p>
@@ -736,21 +736,21 @@
           <w:sz w:val="21"/>
           <w:szCs w:val="21"/>
         </w:rPr>
-        <w:t xml:space="preserve">Seventeen tables. The core domain is users, shops, services, bookings, reviews, posts, likes, comments, favourites, shop_photos and promos. Messaging adds conversations and messages. Notifications add notifications, notification_channels, notification_preferences and user_devices.</w:t>
-      </w:r>
-    </w:p>
-    <w:p>
-      <w:pPr>
-        <w:spacing w:after="110" w:line="300"/>
-      </w:pPr>
-      <w:r>
-        <w:rPr>
-          <w:rFonts w:ascii="Calibri" w:cs="Calibri" w:eastAsia="Calibri" w:hAnsi="Calibri"/>
-          <w:color w:val="2B2118"/>
-          <w:sz w:val="21"/>
-          <w:szCs w:val="21"/>
-        </w:rPr>
-        <w:t xml:space="preserve">A user with role OWNER has exactly one shop; a shop has many services, photos and posts; a booking joins a customer, a shop and a service with a date, time, status and payment record; a review is tied to a specific booking; a conversation is unique per customer-and-shop pair and holds many messages. Every table uses UUID primary keys and all relationships are enforced with foreign keys.</w:t>
+        <w:t xml:space="preserve">Fifteen tables. The core domain is users, shops, services, bookings, reviews, posts, likes, comments, favourites, shop_photos and promos. Notifications add notifications, notification_channels, notification_preferences and user_devices.</w:t>
+      </w:r>
+    </w:p>
+    <w:p>
+      <w:pPr>
+        <w:spacing w:after="110" w:line="300"/>
+      </w:pPr>
+      <w:r>
+        <w:rPr>
+          <w:rFonts w:ascii="Calibri" w:cs="Calibri" w:eastAsia="Calibri" w:hAnsi="Calibri"/>
+          <w:color w:val="2B2118"/>
+          <w:sz w:val="21"/>
+          <w:szCs w:val="21"/>
+        </w:rPr>
+        <w:t xml:space="preserve">A user with role OWNER has exactly one shop; a shop has many services, photos and posts; a booking joins a customer, a shop and a service with a date, time, status and payment record; a review is tied to a specific booking. Every table uses UUID primary keys and all relationships are enforced with foreign keys.</w:t>
       </w:r>
     </w:p>
     <w:p>
@@ -834,7 +834,7 @@
           <w:sz w:val="21"/>
           <w:szCs w:val="21"/>
         </w:rPr>
-        <w:t xml:space="preserve">Hibernate's ddl-auto=update generates and migrates tables from the JPA entity definitions. Adding messaging created four new tables on the next deploy with no manual step.</w:t>
+        <w:t xml:space="preserve">Hibernate's ddl-auto=update generates and migrates tables from the JPA entity definitions.</w:t>
       </w:r>
     </w:p>
     <w:p>
@@ -991,7 +991,7 @@
           <w:sz w:val="21"/>
           <w:szCs w:val="21"/>
         </w:rPr>
-        <w:t xml:space="preserve">Two layers. Role-based routing separates the customer and owner journeys at login. Then every mutating service method re-derives the acting user from the validated token and verifies resource ownership: updating a service first confirms that service belongs to the authenticated owner's shop, otherwise it throws. Messaging works the same way — every chat operation confirms the caller is one of the two participants, because knowing a conversation ID is not authorisation. The client is never trusted with these decisions.</w:t>
+        <w:t xml:space="preserve">Two layers. Role-based routing separates the customer and owner journeys at login. Then every mutating service method re-derives the acting user from the validated token and verifies resource ownership: updating a service first confirms that service belongs to the authenticated owner's shop, otherwise it throws. The client is never trusted with these decisions.</w:t>
       </w:r>
     </w:p>
     <w:p>
@@ -1176,7 +1176,7 @@
           <w:sz w:val="21"/>
           <w:szCs w:val="21"/>
         </w:rPr>
-        <w:t xml:space="preserve">The same overlap check runs server-side inside the create-booking transaction, not just when generating the list. Even if two customers see the same free slot simultaneously, the second confirmation re-checks conflicts at write time and is rejected with a clear message. The client displays availability; the server decides it. A remaining improvement would be a unique index on shop, date and time for active bookings, which would close the window entirely at the database level.</w:t>
+        <w:t xml:space="preserve">The same overlap check runs server-side inside the create-booking transaction, not just when generating the list. Even if two customers see the same free slot simultaneously, the second confirmation re-checks conflicts at write time and is rejected with a clear message. A remaining improvement would be a unique index on shop, date and time for active bookings, which would close the window entirely at the database level.</w:t>
       </w:r>
     </w:p>
     <w:p>
@@ -1218,7 +1218,7 @@
           <w:sz w:val="21"/>
           <w:szCs w:val="21"/>
         </w:rPr>
-        <w:t xml:space="preserve">New bookings start as PENDING with an autoConfirmAt timestamp forty-five seconds ahead. A Spring @Scheduled job runs every ten seconds and promotes expired pending bookings to CONFIRMED, so a customer is never left waiting on an unresponsive shop while the owner still gets a window to respond. A second scheduled job marks confirmed bookings COMPLETED once their end time passes, which is what unlocks the customer's ability to leave a review.</w:t>
+        <w:t xml:space="preserve">New bookings start as PENDING with an autoConfirmAt timestamp forty-five seconds ahead. A Spring @Scheduled job runs every ten seconds and promotes expired pending bookings to CONFIRMED, so a customer is never left waiting on an unresponsive shop while the owner still gets a window to respond. A second scheduled job marks confirmed bookings COMPLETED once their end time passes.</w:t>
       </w:r>
     </w:p>
     <w:p>
@@ -1288,105 +1288,147 @@
           <w:sz w:val="22"/>
           <w:szCs w:val="22"/>
         </w:rPr>
-        <w:t xml:space="preserve">How does direct messaging work?</w:t>
-      </w:r>
-    </w:p>
-    <w:p>
-      <w:pPr>
-        <w:spacing w:after="110" w:line="300"/>
-      </w:pPr>
-      <w:r>
-        <w:rPr>
-          <w:rFonts w:ascii="Calibri" w:cs="Calibri" w:eastAsia="Calibri" w:hAnsi="Calibri"/>
-          <w:color w:val="2B2118"/>
-          <w:sz w:val="21"/>
-          <w:szCs w:val="21"/>
-        </w:rPr>
-        <w:t xml:space="preserve">A conversation is unique per customer-and-shop pair, enforced by a database constraint, so tapping Message a second time reopens the existing thread rather than scattering history across duplicates. Each conversation carries a denormalised last message, timestamp and separate unread counters for the customer and the owner, which lets the inbox render from a single query instead of one per thread.</w:t>
-      </w:r>
-    </w:p>
-    <w:p>
-      <w:pPr>
-        <w:spacing w:after="110" w:line="300"/>
-      </w:pPr>
-      <w:r>
-        <w:rPr>
-          <w:rFonts w:ascii="Calibri" w:cs="Calibri" w:eastAsia="Calibri" w:hAnsi="Calibri"/>
-          <w:color w:val="2B2118"/>
-          <w:sz w:val="21"/>
-          <w:szCs w:val="21"/>
-        </w:rPr>
-        <w:t xml:space="preserve">Sending a message does three things: it saves the message, broadcasts it over STOMP to anyone with the thread open, and publishes a MessageCreatedEvent that becomes a notification and a push for whoever is not looking. The chat screen polls every five seconds rather than subscribing to the WebSocket, which was a deliberate trade — it avoids adding a WebSocket client dependency, and push notifications cover the case where the app is closed entirely.</w:t>
-      </w:r>
-    </w:p>
-    <w:p>
-      <w:pPr>
-        <w:keepNext/>
-        <w:spacing w:after="90" w:before="240"/>
-      </w:pPr>
-      <w:r>
-        <w:rPr>
-          <w:rFonts w:ascii="Calibri" w:cs="Calibri" w:eastAsia="Calibri" w:hAnsi="Calibri"/>
-          <w:b/>
-          <w:bCs/>
-          <w:color w:val="B08A1E"/>
-          <w:sz w:val="22"/>
-          <w:szCs w:val="22"/>
-        </w:rPr>
-        <w:t xml:space="preserve">Q:  </w:t>
-      </w:r>
-      <w:r>
-        <w:rPr>
-          <w:rFonts w:ascii="Calibri" w:cs="Calibri" w:eastAsia="Calibri" w:hAnsi="Calibri"/>
-          <w:b/>
-          <w:bCs/>
-          <w:color w:val="2B2118"/>
-          <w:sz w:val="22"/>
-          <w:szCs w:val="22"/>
-        </w:rPr>
-        <w:t xml:space="preserve">How do notifications work end to end?</w:t>
-      </w:r>
-    </w:p>
-    <w:p>
-      <w:pPr>
-        <w:spacing w:after="110" w:line="300"/>
-      </w:pPr>
-      <w:r>
-        <w:rPr>
-          <w:rFonts w:ascii="Calibri" w:cs="Calibri" w:eastAsia="Calibri" w:hAnsi="Calibri"/>
-          <w:color w:val="2B2118"/>
-          <w:sz w:val="21"/>
-          <w:szCs w:val="21"/>
-        </w:rPr>
-        <w:t xml:space="preserve">Six kinds of event feed one pipeline. Listeners convert each event into a call to NotificationService, which checks the user's preferences, stores the notification, broadcasts it over the WebSocket to any open app, and pushes it to every registered device.</w:t>
-      </w:r>
-    </w:p>
-    <w:p>
-      <w:pPr>
-        <w:spacing w:after="110" w:line="300"/>
-      </w:pPr>
-      <w:r>
-        <w:rPr>
-          <w:rFonts w:ascii="Calibri" w:cs="Calibri" w:eastAsia="Calibri" w:hAnsi="Calibri"/>
-          <w:color w:val="2B2118"/>
-          <w:sz w:val="21"/>
-          <w:szCs w:val="21"/>
-        </w:rPr>
-        <w:t xml:space="preserve">Preferences are checked inside NotificationService rather than at each call site. That means muting a category suppresses it everywhere at once, and any notification type added later inherits the rule for free. The master push switch is separate from the category switches by design: turning push off still records the notification for the in-app bell, because silencing a phone should not mean losing the record.</w:t>
-      </w:r>
-    </w:p>
-    <w:p>
-      <w:pPr>
-        <w:spacing w:after="110" w:line="300"/>
-      </w:pPr>
-      <w:r>
-        <w:rPr>
-          <w:rFonts w:ascii="Calibri" w:cs="Calibri" w:eastAsia="Calibri" w:hAnsi="Calibri"/>
-          <w:color w:val="2B2118"/>
-          <w:sz w:val="21"/>
-          <w:szCs w:val="21"/>
-        </w:rPr>
-        <w:t xml:space="preserve">Push delivery goes through the Expo Push API, which fans out to Firebase Cloud Messaging and APNs. The practical benefit is that the server holds no Firebase credentials at all — it stores an Expo push token per signed-in device and posts to Expo over HTTPS.</w:t>
+        <w:t xml:space="preserve">How do you keep reviews trustworthy?</w:t>
+      </w:r>
+    </w:p>
+    <w:p>
+      <w:pPr>
+        <w:spacing w:after="110" w:line="300"/>
+      </w:pPr>
+      <w:r>
+        <w:rPr>
+          <w:rFonts w:ascii="Calibri" w:cs="Calibri" w:eastAsia="Calibri" w:hAnsi="Calibri"/>
+          <w:color w:val="2B2118"/>
+          <w:sz w:val="21"/>
+          <w:szCs w:val="21"/>
+        </w:rPr>
+        <w:t xml:space="preserve">A review must attach to a real booking, each booking can be reviewed exactly once, and the booking must be COMPLETED — meaning the appointment time has passed. Each new review recalculates the shop's average rating and count, and owners can reply publicly.</w:t>
+      </w:r>
+    </w:p>
+    <w:p>
+      <w:pPr>
+        <w:spacing w:after="110" w:line="300"/>
+      </w:pPr>
+      <w:r>
+        <w:rPr>
+          <w:rFonts w:ascii="Calibri" w:cs="Calibri" w:eastAsia="Calibri" w:hAnsi="Calibri"/>
+          <w:color w:val="2B2118"/>
+          <w:sz w:val="21"/>
+          <w:szCs w:val="21"/>
+        </w:rPr>
+        <w:t xml:space="preserve">That rule was tightened deliberately. It previously accepted a merely CONFIRMED booking, and bookings auto-confirm forty-five seconds after being made — so a customer could book and leave five stars a minute later having never attended. Requiring COMPLETED closes that.</w:t>
+      </w:r>
+    </w:p>
+    <w:p>
+      <w:pPr>
+        <w:keepNext/>
+        <w:spacing w:after="90" w:before="240"/>
+      </w:pPr>
+      <w:r>
+        <w:rPr>
+          <w:rFonts w:ascii="Calibri" w:cs="Calibri" w:eastAsia="Calibri" w:hAnsi="Calibri"/>
+          <w:b/>
+          <w:bCs/>
+          <w:color w:val="B08A1E"/>
+          <w:sz w:val="22"/>
+          <w:szCs w:val="22"/>
+        </w:rPr>
+        <w:t xml:space="preserve">Q:  </w:t>
+      </w:r>
+      <w:r>
+        <w:rPr>
+          <w:rFonts w:ascii="Calibri" w:cs="Calibri" w:eastAsia="Calibri" w:hAnsi="Calibri"/>
+          <w:b/>
+          <w:bCs/>
+          <w:color w:val="2B2118"/>
+          <w:sz w:val="22"/>
+          <w:szCs w:val="22"/>
+        </w:rPr>
+        <w:t xml:space="preserve">But how do you actually know the customer turned up?</w:t>
+      </w:r>
+    </w:p>
+    <w:p>
+      <w:pPr>
+        <w:spacing w:after="110" w:line="300"/>
+      </w:pPr>
+      <w:r>
+        <w:rPr>
+          <w:rFonts w:ascii="Calibri" w:cs="Calibri" w:eastAsia="Calibri" w:hAnsi="Calibri"/>
+          <w:color w:val="2B2118"/>
+          <w:sz w:val="21"/>
+          <w:szCs w:val="21"/>
+        </w:rPr>
+        <w:t xml:space="preserve">You don't, and I would rather say so than claim otherwise. Completion is inferred from the clock: a scheduled job marks a booking COMPLETED once its start time plus the service duration has passed. Nothing in the system observes attendance.</w:t>
+      </w:r>
+    </w:p>
+    <w:p>
+      <w:pPr>
+        <w:spacing w:after="110" w:line="300"/>
+      </w:pPr>
+      <w:r>
+        <w:rPr>
+          <w:rFonts w:ascii="Calibri" w:cs="Calibri" w:eastAsia="Calibri" w:hAnsi="Calibri"/>
+          <w:color w:val="2B2118"/>
+          <w:sz w:val="21"/>
+          <w:szCs w:val="21"/>
+        </w:rPr>
+        <w:t xml:space="preserve">That is why the dashboard says Revenue rather than Earned, and why the review rule is the best available proxy rather than a guarantee. The correct fix is an explicit check-in — the customer confirming arrival, or the owner marking it — and it is the first item on the roadmap. It was left out because any confirmation step only works if someone reliably performs it, and designing that properly needs real shops to test with.</w:t>
+      </w:r>
+    </w:p>
+    <w:p>
+      <w:pPr>
+        <w:keepNext/>
+        <w:spacing w:after="90" w:before="240"/>
+      </w:pPr>
+      <w:r>
+        <w:rPr>
+          <w:rFonts w:ascii="Calibri" w:cs="Calibri" w:eastAsia="Calibri" w:hAnsi="Calibri"/>
+          <w:b/>
+          <w:bCs/>
+          <w:color w:val="B08A1E"/>
+          <w:sz w:val="22"/>
+          <w:szCs w:val="22"/>
+        </w:rPr>
+        <w:t xml:space="preserve">Q:  </w:t>
+      </w:r>
+      <w:r>
+        <w:rPr>
+          <w:rFonts w:ascii="Calibri" w:cs="Calibri" w:eastAsia="Calibri" w:hAnsi="Calibri"/>
+          <w:b/>
+          <w:bCs/>
+          <w:color w:val="2B2118"/>
+          <w:sz w:val="22"/>
+          <w:szCs w:val="22"/>
+        </w:rPr>
+        <w:t xml:space="preserve">How is revenue calculated?</w:t>
+      </w:r>
+    </w:p>
+    <w:p>
+      <w:pPr>
+        <w:spacing w:after="110" w:line="300"/>
+      </w:pPr>
+      <w:r>
+        <w:rPr>
+          <w:rFonts w:ascii="Calibri" w:cs="Calibri" w:eastAsia="Calibri" w:hAnsi="Calibri"/>
+          <w:color w:val="2B2118"/>
+          <w:sz w:val="21"/>
+          <w:szCs w:val="21"/>
+        </w:rPr>
+        <w:t xml:space="preserve">The owner dashboard totals the value of bookings completed in the current month. No manual step is required, which matters because a busy shop owner will not reliably tap anything mid-appointment.</w:t>
+      </w:r>
+    </w:p>
+    <w:p>
+      <w:pPr>
+        <w:spacing w:after="110" w:line="300"/>
+      </w:pPr>
+      <w:r>
+        <w:rPr>
+          <w:rFonts w:ascii="Calibri" w:cs="Calibri" w:eastAsia="Calibri" w:hAnsi="Calibri"/>
+          <w:color w:val="2B2118"/>
+          <w:sz w:val="21"/>
+          <w:szCs w:val="21"/>
+        </w:rPr>
+        <w:t xml:space="preserve">The figure is labelled Revenue this month, not Earned, precisely because completion is time-based. A no-show that was never cancelled still counts. Calling booked revenue 'earned' would overstate what the system knows.</w:t>
       </w:r>
     </w:p>
     <w:p>
@@ -1428,63 +1470,35 @@
           <w:sz w:val="21"/>
           <w:szCs w:val="21"/>
         </w:rPr>
-        <w:t xml:space="preserve">No, and the distinction matters. StyleBook records payments; it does not process them. Money changes hands at the shop in cash, by mobile money transfer, or on a card terminal. The owner then records what was taken, which marks the booking paid and completed, sends the customer a push notification and an emailed receipt, and feeds the earnings figure on the dashboard.</w:t>
-      </w:r>
-    </w:p>
-    <w:p>
-      <w:pPr>
-        <w:spacing w:after="110" w:line="300"/>
-      </w:pPr>
-      <w:r>
-        <w:rPr>
-          <w:rFonts w:ascii="Calibri" w:cs="Calibri" w:eastAsia="Calibri" w:hAnsi="Calibri"/>
-          <w:color w:val="2B2118"/>
-          <w:sz w:val="21"/>
-          <w:szCs w:val="21"/>
-        </w:rPr>
-        <w:t xml:space="preserve">Subscription upgrades use a simulated checkout that walks through network selection, number entry and an authorisation wait mirroring a real mobile money prompt. Every screen in it is labelled as a demo and nothing is transmitted. Handling other people's money requires a licensed processor, so real payments would mean integrating Paystack or Hubtel and confirming settlement through a webhook before changing the plan. Presenting a simulated payment as a real one would have been the wrong thing to build.</w:t>
-      </w:r>
-    </w:p>
-    <w:p>
-      <w:pPr>
-        <w:keepNext/>
-        <w:spacing w:after="90" w:before="240"/>
-      </w:pPr>
-      <w:r>
-        <w:rPr>
-          <w:rFonts w:ascii="Calibri" w:cs="Calibri" w:eastAsia="Calibri" w:hAnsi="Calibri"/>
-          <w:b/>
-          <w:bCs/>
-          <w:color w:val="B08A1E"/>
-          <w:sz w:val="22"/>
-          <w:szCs w:val="22"/>
-        </w:rPr>
-        <w:t xml:space="preserve">Q:  </w:t>
-      </w:r>
-      <w:r>
-        <w:rPr>
-          <w:rFonts w:ascii="Calibri" w:cs="Calibri" w:eastAsia="Calibri" w:hAnsi="Calibri"/>
-          <w:b/>
-          <w:bCs/>
-          <w:color w:val="2B2118"/>
-          <w:sz w:val="22"/>
-          <w:szCs w:val="22"/>
-        </w:rPr>
-        <w:t xml:space="preserve">How do you keep reviews trustworthy?</w:t>
-      </w:r>
-    </w:p>
-    <w:p>
-      <w:pPr>
-        <w:spacing w:after="110" w:line="300"/>
-      </w:pPr>
-      <w:r>
-        <w:rPr>
-          <w:rFonts w:ascii="Calibri" w:cs="Calibri" w:eastAsia="Calibri" w:hAnsi="Calibri"/>
-          <w:color w:val="2B2118"/>
-          <w:sz w:val="21"/>
-          <w:szCs w:val="21"/>
-        </w:rPr>
-        <w:t xml:space="preserve">A review must be attached to a real booking that was confirmed or completed, and each booking can be reviewed only once. You cannot review a shop you never visited. Each new review recalculates the shop's average rating and count, and owners can reply publicly to any review.</w:t>
+        <w:t xml:space="preserve">No, and the distinction matters. StyleBook records payments; it does not process them. Money changes hands at the shop in cash, by mobile money transfer, or on a card terminal.</w:t>
+      </w:r>
+    </w:p>
+    <w:p>
+      <w:pPr>
+        <w:spacing w:after="110" w:line="300"/>
+      </w:pPr>
+      <w:r>
+        <w:rPr>
+          <w:rFonts w:ascii="Calibri" w:cs="Calibri" w:eastAsia="Calibri" w:hAnsi="Calibri"/>
+          <w:color w:val="2B2118"/>
+          <w:sz w:val="21"/>
+          <w:szCs w:val="21"/>
+        </w:rPr>
+        <w:t xml:space="preserve">An owner may optionally record what was taken, which stores the method and sends the customer a push notification and an emailed receipt. It is optional by design — the dashboard figure does not depend on it.</w:t>
+      </w:r>
+    </w:p>
+    <w:p>
+      <w:pPr>
+        <w:spacing w:after="110" w:line="300"/>
+      </w:pPr>
+      <w:r>
+        <w:rPr>
+          <w:rFonts w:ascii="Calibri" w:cs="Calibri" w:eastAsia="Calibri" w:hAnsi="Calibri"/>
+          <w:color w:val="2B2118"/>
+          <w:sz w:val="21"/>
+          <w:szCs w:val="21"/>
+        </w:rPr>
+        <w:t xml:space="preserve">Subscription upgrades use a simulated checkout that mirrors a real mobile money prompt. Every screen in it is labelled as a demo and nothing is transmitted. Real payments would mean integrating Paystack or Hubtel and confirming settlement through a webhook. Presenting a simulated payment as a real one would have been the wrong thing to build.</w:t>
       </w:r>
     </w:p>
     <w:p>
@@ -1767,21 +1781,63 @@
           <w:sz w:val="21"/>
           <w:szCs w:val="21"/>
         </w:rPr>
-        <w:t xml:space="preserve">Second, email delivery hung and timed out because the platform silently blocks outbound SMTP on port 587, a common anti-abuse restriction. Switching to an HTTPS email API rather than SMTP resolved it, since HTTPS is not subject to the same port blocking.</w:t>
-      </w:r>
-    </w:p>
-    <w:p>
-      <w:pPr>
-        <w:spacing w:after="110" w:line="300"/>
-      </w:pPr>
-      <w:r>
-        <w:rPr>
-          <w:rFonts w:ascii="Calibri" w:cs="Calibri" w:eastAsia="Calibri" w:hAnsi="Calibri"/>
-          <w:color w:val="2B2118"/>
-          <w:sz w:val="21"/>
-          <w:szCs w:val="21"/>
-        </w:rPr>
-        <w:t xml:space="preserve">Third, and most instructive: merged code kept not appearing in production. Auto-deploy was disabled on the hosting platform, so every restart was relaunching the previous image. What gave it away was the startup log reporting fourteen JPA repositories when the new code defines sixteen. All three taught the same lesson — verify what is actually running, not what you believe you deployed.</w:t>
+        <w:t xml:space="preserve">Second, email delivery hung and timed out because the platform silently blocks outbound SMTP on port 587. Switching to an HTTPS email API resolved it, since HTTPS is not subject to the same port blocking.</w:t>
+      </w:r>
+    </w:p>
+    <w:p>
+      <w:pPr>
+        <w:spacing w:after="110" w:line="300"/>
+      </w:pPr>
+      <w:r>
+        <w:rPr>
+          <w:rFonts w:ascii="Calibri" w:cs="Calibri" w:eastAsia="Calibri" w:hAnsi="Calibri"/>
+          <w:color w:val="2B2118"/>
+          <w:sz w:val="21"/>
+          <w:szCs w:val="21"/>
+        </w:rPr>
+        <w:t xml:space="preserve">Third, and most instructive: merged code kept not appearing in production. Auto-deploy was disabled, so every restart was relaunching the previous image. What gave it away was the startup log reporting fourteen JPA repositories when the new code defined sixteen. All three taught the same lesson — verify what is actually running, not what you believe you deployed.</w:t>
+      </w:r>
+    </w:p>
+    <w:p>
+      <w:pPr>
+        <w:keepNext/>
+        <w:spacing w:after="90" w:before="240"/>
+      </w:pPr>
+      <w:r>
+        <w:rPr>
+          <w:rFonts w:ascii="Calibri" w:cs="Calibri" w:eastAsia="Calibri" w:hAnsi="Calibri"/>
+          <w:b/>
+          <w:bCs/>
+          <w:color w:val="B08A1E"/>
+          <w:sz w:val="22"/>
+          <w:szCs w:val="22"/>
+        </w:rPr>
+        <w:t xml:space="preserve">Q:  </w:t>
+      </w:r>
+      <w:r>
+        <w:rPr>
+          <w:rFonts w:ascii="Calibri" w:cs="Calibri" w:eastAsia="Calibri" w:hAnsi="Calibri"/>
+          <w:b/>
+          <w:bCs/>
+          <w:color w:val="2B2118"/>
+          <w:sz w:val="22"/>
+          <w:szCs w:val="22"/>
+        </w:rPr>
+        <w:t xml:space="preserve">Did you remove anything, and why?</w:t>
+      </w:r>
+    </w:p>
+    <w:p>
+      <w:pPr>
+        <w:spacing w:after="110" w:line="300"/>
+      </w:pPr>
+      <w:r>
+        <w:rPr>
+          <w:rFonts w:ascii="Calibri" w:cs="Calibri" w:eastAsia="Calibri" w:hAnsi="Calibri"/>
+          <w:color w:val="2B2118"/>
+          <w:sz w:val="21"/>
+          <w:szCs w:val="21"/>
+        </w:rPr>
+        <w:t xml:space="preserve">Yes. Direct messaging between customers and shops was built and then removed. It worked — one thread per customer and shop pair, unread counts, live delivery — but it duplicated WhatsApp, which the app already shares to and which every Ghanaian shop already uses. Carrying a feature that adds surface area without adding value is a cost, not an achievement. Removing it was a scope decision, and the notification pipeline it fed absorbed the change without modification, which was the point of building it event-driven in the first place.</w:t>
       </w:r>
     </w:p>
     <w:p>
@@ -1840,7 +1896,7 @@
           <w:sz w:val="21"/>
           <w:szCs w:val="21"/>
         </w:rPr>
-        <w:t xml:space="preserve">End-to-end manual testing on two physical Android devices simultaneously, one as a customer and one as the owner. That made interactive flows genuinely testable: a booking placed on one phone appears on the other, auto-confirm fires, a chat message arrives as a push, recording a payment produces a receipt. Edge cases covered closed days, fully booked days, overlapping durations, wrong account type at login and double-review attempts.</w:t>
+        <w:t xml:space="preserve">End-to-end manual testing on two physical Android devices simultaneously, one as a customer and one as the owner. That made interactive flows genuinely testable: a booking placed on one phone appears on the other, auto-confirm fires, recording a payment produces a receipt. Edge cases covered closed days, fully booked days, overlapping durations, wrong account type at login and double-review attempts.</w:t>
       </w:r>
     </w:p>
     <w:p>
@@ -1997,7 +2053,7 @@
           <w:sz w:val="21"/>
           <w:szCs w:val="21"/>
         </w:rPr>
-        <w:t xml:space="preserve">Payments are recorded rather than processed, and subscription upgrades use a simulated checkout. User-uploaded images do not survive a redeploy because they are written to the container filesystem. Testing is manual. Email verification codes are sent but not enforced at login, for a smoother demo — the enforcement path exists and can be switched on. And the security configuration leaves some write endpoints permitted at the filter level, relying on service-layer ownership checks; that works, but the intent would be clearer if the configuration enforced it too.</w:t>
+        <w:t xml:space="preserve">Attendance is inferred from the clock rather than confirmed, so completed bookings and therefore revenue include no-shows. Payments are recorded rather than processed, and subscription upgrades use a simulated checkout. User-uploaded images do not survive a redeploy because they are written to the container filesystem. Testing is manual. Email verification codes are sent but not enforced at login, for a smoother demo — the enforcement path exists and can be switched on.</w:t>
       </w:r>
     </w:p>
     <w:p>
@@ -2039,7 +2095,7 @@
           <w:sz w:val="21"/>
           <w:szCs w:val="21"/>
         </w:rPr>
-        <w:t xml:space="preserve">In order of impact: real mobile money through Paystack or Hubtel, with a settlement webhook, to replace the simulated checkout; persistent media storage on a mounted volume or object store; automated tests around the slot engine; staff-level booking so a customer can choose a specific barber with their own calendar; and a map view of nearby shops.</w:t>
+        <w:t xml:space="preserve">In order of impact: an attendance check-in so completion is known rather than inferred, which makes both the revenue figure and the review rule sound; real mobile money through Paystack or Hubtel with a settlement webhook; persistent media storage on a mounted volume or object store; automated tests around the slot engine; staff-level booking so a customer can choose a specific barber; and a map view of nearby shops.</w:t>
       </w:r>
     </w:p>
     <w:p>
@@ -2081,7 +2137,7 @@
           <w:sz w:val="21"/>
           <w:szCs w:val="21"/>
         </w:rPr>
-        <w:t xml:space="preserve">The backend is stateless thanks to JWT, so it scales horizontally behind a load balancer immediately. After that, in order of impact: database indexes on the hot query paths, which are bookings by shop and date, and conversations by participant; caching for read-heavy data like shop profiles; moving image storage to object storage with a CDN; replacing the in-memory STOMP broker with a real message broker so WebSocket delivery works across multiple instances; and only when justified by load, extracting the booking domain into its own deployable.</w:t>
+        <w:t xml:space="preserve">The backend is stateless thanks to JWT, so it scales horizontally behind a load balancer immediately. After that, in order of impact: database indexes on the hot query paths, which are bookings by shop and date; caching for read-heavy data like shop profiles; moving image storage to object storage with a CDN; replacing the in-memory STOMP broker with a real message broker so WebSocket delivery works across multiple instances; and only when justified by load, extracting the booking domain into its own deployable.</w:t>
       </w:r>
     </w:p>
     <w:p>
@@ -2123,21 +2179,35 @@
           <w:sz w:val="21"/>
           <w:szCs w:val="21"/>
         </w:rPr>
-        <w:t xml:space="preserve">That correctness lives on the server: any rule that matters — availability, ownership, review eligibility, chat membership, plan limits — must be enforced where the client cannot bypass it.</w:t>
-      </w:r>
-    </w:p>
-    <w:p>
-      <w:pPr>
-        <w:spacing w:after="110" w:line="300"/>
-      </w:pPr>
-      <w:r>
-        <w:rPr>
-          <w:rFonts w:ascii="Calibri" w:cs="Calibri" w:eastAsia="Calibri" w:hAnsi="Calibri"/>
-          <w:color w:val="2B2118"/>
-          <w:sz w:val="21"/>
-          <w:szCs w:val="21"/>
-        </w:rPr>
-        <w:t xml:space="preserve">The second lesson was about observability. Several of the hardest bugs were not complicated; they were invisible. A vague success message, a swallowed exception, a deploy that never happened. In each case the fix began with making the system say what it was actually doing. Building software that reports on itself honestly turned out to be as important as building it correctly in the first place.</w:t>
+        <w:t xml:space="preserve">That correctness lives on the server: any rule that matters — availability, ownership, review eligibility, plan limits — must be enforced where the client cannot bypass it.</w:t>
+      </w:r>
+    </w:p>
+    <w:p>
+      <w:pPr>
+        <w:spacing w:after="110" w:line="300"/>
+      </w:pPr>
+      <w:r>
+        <w:rPr>
+          <w:rFonts w:ascii="Calibri" w:cs="Calibri" w:eastAsia="Calibri" w:hAnsi="Calibri"/>
+          <w:color w:val="2B2118"/>
+          <w:sz w:val="21"/>
+          <w:szCs w:val="21"/>
+        </w:rPr>
+        <w:t xml:space="preserve">The second lesson was about observability. Several of the hardest bugs were not complicated; they were invisible. A vague success message, a swallowed exception, a deploy that never happened. In each case the fix began with making the system say what it was actually doing.</w:t>
+      </w:r>
+    </w:p>
+    <w:p>
+      <w:pPr>
+        <w:spacing w:after="110" w:line="300"/>
+      </w:pPr>
+      <w:r>
+        <w:rPr>
+          <w:rFonts w:ascii="Calibri" w:cs="Calibri" w:eastAsia="Calibri" w:hAnsi="Calibri"/>
+          <w:color w:val="2B2118"/>
+          <w:sz w:val="21"/>
+          <w:szCs w:val="21"/>
+        </w:rPr>
+        <w:t xml:space="preserve">The third was about honesty in what software claims. It is tempting to label a number 'Earned' or a review 'verified' because it reads better. Being precise about what the system actually knows — and naming the gap out loud — turned out to be more defensible than the flattering version.</w:t>
       </w:r>
     </w:p>
     <w:sectPr>

</xml_diff>